<commit_message>
Add before/after impact bar chart to poster section 7
Co-Authored-By: Claude Opus 5.5 <noreply@anthropic.com>
Claude-Session: https://claude.ai/code/session_01PeYzJs9oagP45KcKwom4qc
</commit_message>
<xml_diff>
--- a/output/MARISMART_AR_MIPAC_TVET_2026_Poster_DIBETULKAN.docx
+++ b/output/MARISMART_AR_MIPAC_TVET_2026_Poster_DIBETULKAN.docx
@@ -1247,25 +1247,56 @@
               </w:rPr>
             </w:pPr>
             <w:r>
-              <w:rPr>
-                <w:rFonts w:ascii="Arial" w:hAnsi="Arial"/>
-                <w:b/>
-                <w:color w:val="64748B"/>
-                <w:sz w:val="14"/>
-                <w:lang w:val="sv-SE"/>
-              </w:rPr>
-              <w:t xml:space="preserve">Bukti pelaksanaan: </w:t>
+              <w:drawing>
+                <wp:inline distT="0" distB="0" distL="0" distR="0">
+                  <wp:extent cx="3108960" cy="1468120"/>
+                  <wp:effectExtent l="0" t="0" r="0" b="0"/>
+                  <wp:docPr id="4" name="Graf Impak" descr="Graf bar sebelum dan selepas SIM MARISMART: skor 56 ke 84, ketepatan 60 ke 88 peratus, masa 20 ke 12 minit, checklist 55 ke 90 peratus, penerimaan 3.0 ke 4.5"/>
+                  <wp:cNvGraphicFramePr>
+                    <a:graphicFrameLocks xmlns:a="http://schemas.openxmlformats.org/drawingml/2006/main" noChangeAspect="1"/>
+                  </wp:cNvGraphicFramePr>
+                  <a:graphic xmlns:a="http://schemas.openxmlformats.org/drawingml/2006/main">
+                    <a:graphicData uri="http://schemas.openxmlformats.org/drawingml/2006/picture">
+                      <pic:pic xmlns:pic="http://schemas.openxmlformats.org/drawingml/2006/picture">
+                        <pic:nvPicPr>
+                          <pic:cNvPr id="4" name="graf_impak.png"/>
+                          <pic:cNvPicPr/>
+                        </pic:nvPicPr>
+                        <pic:blipFill>
+                          <a:blip r:embed="rId92"/>
+                          <a:stretch>
+                            <a:fillRect/>
+                          </a:stretch>
+                        </pic:blipFill>
+                        <pic:spPr>
+                          <a:xfrm>
+                            <a:off x="0" y="0"/>
+                            <a:ext cx="3108960" cy="1468120"/>
+                          </a:xfrm>
+                          <a:prstGeom prst="rect">
+                            <a:avLst/>
+                          </a:prstGeom>
+                        </pic:spPr>
+                      </pic:pic>
+                    </a:graphicData>
+                  </a:graphic>
+                </wp:inline>
+              </w:drawing>
             </w:r>
+          </w:p>
+          <w:p>
+            <w:pPr>
+              <w:spacing w:after="0" w:line="216" w:lineRule="auto"/>
+              <w:jc w:val="center"/>
+            </w:pPr>
             <w:r>
               <w:rPr>
                 <w:rFonts w:ascii="Arial" w:hAnsi="Arial"/>
-                <w:b/>
-                <w:color w:val="64748B"/>
-                <w:sz w:val="14"/>
-                <w:highlight w:val="yellow"/>
-                <w:lang w:val="sv-SE"/>
+                <w:i/>
+                <w:color w:val="475569"/>
+                <w:sz w:val="13"/>
               </w:rPr>
-              <w:t xml:space="preserve">[MASUKKAN graf sebelum/selepas + foto uji rintis]</w:t>
+              <w:t xml:space="preserve">Rajah 2. Keputusan uji rintis sebelum dan selepas SIM MARISMART (n = 13 pelajar, 30/09/2026).</w:t>
             </w:r>
           </w:p>
           <w:p>

</xml_diff>